<commit_message>
Update to new CV: dates, Openly and FarMorfX projects, Instagram, news slots; drop CoreApex and CyberVision
</commit_message>
<xml_diff>
--- a/Shikhi_Ibrahimov_cv.docx
+++ b/Shikhi_Ibrahimov_cv.docx
@@ -1,6 +1,6 @@
 
 <file path=word/document.xml><?xml version="1.0" encoding="utf-8"?>
-<w:document xmlns:wpc="http://schemas.microsoft.com/office/word/2010/wordprocessingCanvas" xmlns:cx="http://schemas.microsoft.com/office/drawing/2014/chartex" xmlns:cx1="http://schemas.microsoft.com/office/drawing/2015/9/8/chartex" xmlns:cx2="http://schemas.microsoft.com/office/drawing/2015/10/21/chartex" xmlns:cx3="http://schemas.microsoft.com/office/drawing/2016/5/9/chartex" xmlns:cx4="http://schemas.microsoft.com/office/drawing/2016/5/10/chartex" xmlns:cx5="http://schemas.microsoft.com/office/drawing/2016/5/11/chartex" xmlns:cx6="http://schemas.microsoft.com/office/drawing/2016/5/12/chartex" xmlns:cx7="http://schemas.microsoft.com/office/drawing/2016/5/13/chartex" xmlns:cx8="http://schemas.microsoft.com/office/drawing/2016/5/14/chartex" xmlns:mc="http://schemas.openxmlformats.org/markup-compatibility/2006" xmlns:aink="http://schemas.microsoft.com/office/drawing/2016/ink" xmlns:am3d="http://schemas.microsoft.com/office/drawing/2017/model3d" xmlns:o="urn:schemas-microsoft-com:office:office" xmlns:oel="http://schemas.microsoft.com/office/2019/extlst" xmlns:r="http://schemas.openxmlformats.org/officeDocument/2006/relationships" xmlns:m="http://schemas.openxmlformats.org/officeDocument/2006/math" xmlns:v="urn:schemas-microsoft-com:vml" xmlns:wp14="http://schemas.microsoft.com/office/word/2010/wordprocessingDrawing" xmlns:wp="http://schemas.openxmlformats.org/drawingml/2006/wordprocessingDrawing" xmlns:w10="urn:schemas-microsoft-com:office:word" xmlns:w="http://schemas.openxmlformats.org/wordprocessingml/2006/main" xmlns:w14="http://schemas.microsoft.com/office/word/2010/wordml" xmlns:w15="http://schemas.microsoft.com/office/word/2012/wordml" xmlns:w16cex="http://schemas.microsoft.com/office/word/2018/wordml/cex" xmlns:w16cid="http://schemas.microsoft.com/office/word/2016/wordml/cid" xmlns:w16="http://schemas.microsoft.com/office/word/2018/wordml" xmlns:w16sdtdh="http://schemas.microsoft.com/office/word/2020/wordml/sdtdatahash" xmlns:w16se="http://schemas.microsoft.com/office/word/2015/wordml/symex" xmlns:wpg="http://schemas.microsoft.com/office/word/2010/wordprocessingGroup" xmlns:wpi="http://schemas.microsoft.com/office/word/2010/wordprocessingInk" xmlns:wne="http://schemas.microsoft.com/office/word/2006/wordml" xmlns:wps="http://schemas.microsoft.com/office/word/2010/wordprocessingShape" mc:Ignorable="w14 w15 w16se w16cid w16 w16cex w16sdtdh wp14">
+<w:document xmlns:wpc="http://schemas.microsoft.com/office/word/2010/wordprocessingCanvas" xmlns:cx="http://schemas.microsoft.com/office/drawing/2014/chartex" xmlns:cx1="http://schemas.microsoft.com/office/drawing/2015/9/8/chartex" xmlns:cx2="http://schemas.microsoft.com/office/drawing/2015/10/21/chartex" xmlns:cx3="http://schemas.microsoft.com/office/drawing/2016/5/9/chartex" xmlns:cx4="http://schemas.microsoft.com/office/drawing/2016/5/10/chartex" xmlns:cx5="http://schemas.microsoft.com/office/drawing/2016/5/11/chartex" xmlns:cx6="http://schemas.microsoft.com/office/drawing/2016/5/12/chartex" xmlns:cx7="http://schemas.microsoft.com/office/drawing/2016/5/13/chartex" xmlns:cx8="http://schemas.microsoft.com/office/drawing/2016/5/14/chartex" xmlns:mc="http://schemas.openxmlformats.org/markup-compatibility/2006" xmlns:aink="http://schemas.microsoft.com/office/drawing/2016/ink" xmlns:am3d="http://schemas.microsoft.com/office/drawing/2017/model3d" xmlns:o="urn:schemas-microsoft-com:office:office" xmlns:oel="http://schemas.microsoft.com/office/2019/extlst" xmlns:r="http://schemas.openxmlformats.org/officeDocument/2006/relationships" xmlns:m="http://schemas.openxmlformats.org/officeDocument/2006/math" xmlns:v="urn:schemas-microsoft-com:vml" xmlns:wp14="http://schemas.microsoft.com/office/word/2010/wordprocessingDrawing" xmlns:wp="http://schemas.openxmlformats.org/drawingml/2006/wordprocessingDrawing" xmlns:w10="urn:schemas-microsoft-com:office:word" xmlns:w="http://schemas.openxmlformats.org/wordprocessingml/2006/main" xmlns:w14="http://schemas.microsoft.com/office/word/2010/wordml" xmlns:w15="http://schemas.microsoft.com/office/word/2012/wordml" xmlns:w16cex="http://schemas.microsoft.com/office/word/2018/wordml/cex" xmlns:w16cid="http://schemas.microsoft.com/office/word/2016/wordml/cid" xmlns:w16="http://schemas.microsoft.com/office/word/2018/wordml" xmlns:w16du="http://schemas.microsoft.com/office/word/2023/wordml/word16du" xmlns:w16sdtdh="http://schemas.microsoft.com/office/word/2020/wordml/sdtdatahash" xmlns:w16sdtfl="http://schemas.microsoft.com/office/word/2024/wordml/sdtformatlock" xmlns:w16se="http://schemas.microsoft.com/office/word/2015/wordml/symex" xmlns:wpg="http://schemas.microsoft.com/office/word/2010/wordprocessingGroup" xmlns:wpi="http://schemas.microsoft.com/office/word/2010/wordprocessingInk" xmlns:wne="http://schemas.microsoft.com/office/word/2006/wordml" xmlns:wps="http://schemas.microsoft.com/office/word/2010/wordprocessingShape" mc:Ignorable="w14 w15 w16se w16cid w16 w16cex w16sdtdh w16sdtfl w16du wp14">
   <w:body>
     <w:p>
       <w:pPr>
@@ -145,7 +145,6 @@
                                   <w:sz w:val="36"/>
                                 </w:rPr>
                               </w:pPr>
-                              <w:proofErr w:type="spellStart"/>
                               <w:r>
                                 <w:rPr>
                                   <w:b/>
@@ -154,7 +153,6 @@
                                 </w:rPr>
                                 <w:t>Shikhi</w:t>
                               </w:r>
-                              <w:proofErr w:type="spellEnd"/>
                               <w:r>
                                 <w:rPr>
                                   <w:b/>
@@ -276,7 +274,6 @@
                                 <w:t xml:space="preserve"> </w:t>
                               </w:r>
                               <w:hyperlink r:id="rId6">
-                                <w:proofErr w:type="spellStart"/>
                                 <w:r>
                                   <w:rPr>
                                     <w:color w:val="004493"/>
@@ -286,7 +283,6 @@
                                   </w:rPr>
                                   <w:t>Shikhi</w:t>
                                 </w:r>
-                                <w:proofErr w:type="spellEnd"/>
                                 <w:r>
                                   <w:rPr>
                                     <w:color w:val="004493"/>
@@ -463,8 +459,8 @@
           </mc:Choice>
           <mc:Fallback>
             <w:pict>
-              <v:group w14:anchorId="4EB50CDB" id="Group 1" o:spid="_x0000_s1026" style="position:absolute;margin-left:0;margin-top:0;width:595pt;height:148pt;z-index:15728640;mso-wrap-distance-left:0;mso-wrap-distance-right:0;mso-position-horizontal-relative:page;mso-position-vertical-relative:page" coordsize="75565,18796" o:gfxdata="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">
-                <v:shape id="Graphic 2" o:spid="_x0000_s1027" style="position:absolute;width:75565;height:18796;visibility:visible;mso-wrap-style:square;v-text-anchor:top" coordsize="7556500,1879600" o:gfxdata="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" path="m7556500,1879600l,1879600,,,7556500,r,1879600xe" fillcolor="#f4f4f4" stroked="f">
+              <v:group w14:anchorId="4EB50CDB" id="Group 1" o:spid="_x0000_s1026" style="position:absolute;margin-left:0;margin-top:0;width:595pt;height:148pt;z-index:15728640;mso-wrap-distance-left:0;mso-wrap-distance-right:0;mso-position-horizontal-relative:page;mso-position-vertical-relative:page" coordsize="75565,18796" o:gfxdata="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">
+                <v:shape id="Graphic 2" o:spid="_x0000_s1027" style="position:absolute;width:75565;height:18796;visibility:visible;mso-wrap-style:square;v-text-anchor:top" coordsize="7556500,1879600" o:gfxdata="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" path="m7556500,1879600l,1879600,,,7556500,r,1879600xe" fillcolor="#f4f4f4" stroked="f">
                   <v:path arrowok="t"/>
                 </v:shape>
                 <v:shapetype id="_x0000_t75" coordsize="21600,21600" o:spt="75" o:preferrelative="t" path="m@4@5l@4@11@9@11@9@5xe" filled="f" stroked="f">
@@ -486,14 +482,14 @@
                   <v:path o:extrusionok="f" gradientshapeok="t" o:connecttype="rect"/>
                   <o:lock v:ext="edit" aspectratio="t"/>
                 </v:shapetype>
-                <v:shape id="Image 3" o:spid="_x0000_s1028" type="#_x0000_t75" style="position:absolute;left:4762;top:4000;width:13081;height:13081;visibility:visible;mso-wrap-style:square" o:gfxdata="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">
+                <v:shape id="Image 3" o:spid="_x0000_s1028" type="#_x0000_t75" style="position:absolute;left:4762;top:4000;width:13081;height:13081;visibility:visible;mso-wrap-style:square" o:gfxdata="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">
                   <v:imagedata r:id="rId8" o:title=""/>
                 </v:shape>
                 <v:shapetype id="_x0000_t202" coordsize="21600,21600" o:spt="202" path="m,l,21600r21600,l21600,xe">
                   <v:stroke joinstyle="miter"/>
                   <v:path gradientshapeok="t" o:connecttype="rect"/>
                 </v:shapetype>
-                <v:shape id="Textbox 4" o:spid="_x0000_s1029" type="#_x0000_t202" style="position:absolute;width:75565;height:18796;visibility:visible;mso-wrap-style:square;v-text-anchor:top" o:gfxdata="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" filled="f" stroked="f">
+                <v:shape id="Textbox 4" o:spid="_x0000_s1029" type="#_x0000_t202" style="position:absolute;width:75565;height:18796;visibility:visible;mso-wrap-style:square;v-text-anchor:top" o:gfxdata="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" filled="f" stroked="f">
                   <v:textbox inset="0,0,0,0">
                     <w:txbxContent>
                       <w:p>
@@ -512,7 +508,6 @@
                             <w:sz w:val="36"/>
                           </w:rPr>
                         </w:pPr>
-                        <w:proofErr w:type="spellStart"/>
                         <w:r>
                           <w:rPr>
                             <w:b/>
@@ -521,7 +516,6 @@
                           </w:rPr>
                           <w:t>Shikhi</w:t>
                         </w:r>
-                        <w:proofErr w:type="spellEnd"/>
                         <w:r>
                           <w:rPr>
                             <w:b/>
@@ -643,7 +637,6 @@
                           <w:t xml:space="preserve"> </w:t>
                         </w:r>
                         <w:hyperlink r:id="rId10">
-                          <w:proofErr w:type="spellStart"/>
                           <w:r>
                             <w:rPr>
                               <w:color w:val="004493"/>
@@ -653,7 +646,6 @@
                             </w:rPr>
                             <w:t>Shikhi</w:t>
                           </w:r>
-                          <w:proofErr w:type="spellEnd"/>
                           <w:r>
                             <w:rPr>
                               <w:color w:val="004493"/>
@@ -1252,17 +1244,8 @@
           <w:b/>
           <w:sz w:val="16"/>
         </w:rPr>
-        <w:t xml:space="preserve">Work </w:t>
-      </w:r>
-      <w:proofErr w:type="gramStart"/>
-      <w:r>
-        <w:rPr>
-          <w:b/>
-          <w:sz w:val="16"/>
-        </w:rPr>
-        <w:t>experience</w:t>
-      </w:r>
-      <w:proofErr w:type="gramEnd"/>
+        <w:t>Work experience</w:t>
+      </w:r>
       <w:r>
         <w:rPr>
           <w:b/>
@@ -1369,7 +1352,14 @@
           <w:color w:val="5A5858"/>
           <w:sz w:val="16"/>
         </w:rPr>
-        <w:t xml:space="preserve">02/2026 - </w:t>
+        <w:t xml:space="preserve">May </w:t>
+      </w:r>
+      <w:r>
+        <w:rPr>
+          <w:color w:val="5A5858"/>
+          <w:sz w:val="16"/>
+        </w:rPr>
+        <w:t xml:space="preserve">2026 - </w:t>
       </w:r>
       <w:r>
         <w:rPr>
@@ -1401,12 +1391,21 @@
         </w:rPr>
         <w:t xml:space="preserve"> </w:t>
       </w:r>
-      <w:r>
-        <w:rPr>
-          <w:color w:val="5A5858"/>
-          <w:sz w:val="16"/>
-        </w:rPr>
-        <w:t xml:space="preserve">Baku , </w:t>
+      <w:proofErr w:type="gramStart"/>
+      <w:r>
+        <w:rPr>
+          <w:color w:val="5A5858"/>
+          <w:sz w:val="16"/>
+        </w:rPr>
+        <w:t>Baku ,</w:t>
+      </w:r>
+      <w:proofErr w:type="gramEnd"/>
+      <w:r>
+        <w:rPr>
+          <w:color w:val="5A5858"/>
+          <w:sz w:val="16"/>
+        </w:rPr>
+        <w:t xml:space="preserve"> </w:t>
       </w:r>
       <w:r>
         <w:rPr>
@@ -1543,7 +1542,28 @@
           <w:color w:val="5A5858"/>
           <w:sz w:val="16"/>
         </w:rPr>
-        <w:t xml:space="preserve">02/2026 - </w:t>
+        <w:t xml:space="preserve">Feb </w:t>
+      </w:r>
+      <w:r>
+        <w:rPr>
+          <w:color w:val="5A5858"/>
+          <w:sz w:val="16"/>
+        </w:rPr>
+        <w:t xml:space="preserve">2026 </w:t>
+      </w:r>
+      <w:r>
+        <w:rPr>
+          <w:color w:val="5A5858"/>
+          <w:sz w:val="16"/>
+        </w:rPr>
+        <w:t>–</w:t>
+      </w:r>
+      <w:r>
+        <w:rPr>
+          <w:color w:val="5A5858"/>
+          <w:sz w:val="16"/>
+        </w:rPr>
+        <w:t xml:space="preserve"> </w:t>
       </w:r>
       <w:r>
         <w:rPr>
@@ -1551,7 +1571,15 @@
           <w:spacing w:val="-2"/>
           <w:sz w:val="16"/>
         </w:rPr>
-        <w:t>05/2026</w:t>
+        <w:t xml:space="preserve">May </w:t>
+      </w:r>
+      <w:r>
+        <w:rPr>
+          <w:color w:val="5A5858"/>
+          <w:spacing w:val="-2"/>
+          <w:sz w:val="16"/>
+        </w:rPr>
+        <w:t>2026</w:t>
       </w:r>
       <w:r>
         <w:rPr>
@@ -1575,12 +1603,21 @@
         </w:rPr>
         <w:t xml:space="preserve"> </w:t>
       </w:r>
-      <w:r>
-        <w:rPr>
-          <w:color w:val="5A5858"/>
-          <w:sz w:val="16"/>
-        </w:rPr>
-        <w:t xml:space="preserve">Baku , </w:t>
+      <w:proofErr w:type="gramStart"/>
+      <w:r>
+        <w:rPr>
+          <w:color w:val="5A5858"/>
+          <w:sz w:val="16"/>
+        </w:rPr>
+        <w:t>Baku ,</w:t>
+      </w:r>
+      <w:proofErr w:type="gramEnd"/>
+      <w:r>
+        <w:rPr>
+          <w:color w:val="5A5858"/>
+          <w:sz w:val="16"/>
+        </w:rPr>
+        <w:t xml:space="preserve"> </w:t>
       </w:r>
       <w:r>
         <w:rPr>
@@ -2049,7 +2086,14 @@
           <w:color w:val="5A5858"/>
           <w:sz w:val="16"/>
         </w:rPr>
-        <w:t xml:space="preserve">11/2025 - </w:t>
+        <w:t xml:space="preserve">Nov </w:t>
+      </w:r>
+      <w:r>
+        <w:rPr>
+          <w:color w:val="5A5858"/>
+          <w:sz w:val="16"/>
+        </w:rPr>
+        <w:t xml:space="preserve">2025 - </w:t>
       </w:r>
       <w:proofErr w:type="gramStart"/>
       <w:r>
@@ -2084,6 +2128,7 @@
         <w:t xml:space="preserve"> </w:t>
       </w:r>
       <w:proofErr w:type="spellStart"/>
+      <w:proofErr w:type="gramStart"/>
       <w:r>
         <w:rPr>
           <w:color w:val="5A5858"/>
@@ -2097,7 +2142,15 @@
           <w:color w:val="5A5858"/>
           <w:sz w:val="16"/>
         </w:rPr>
-        <w:t xml:space="preserve"> , </w:t>
+        <w:t xml:space="preserve"> ,</w:t>
+      </w:r>
+      <w:proofErr w:type="gramEnd"/>
+      <w:r>
+        <w:rPr>
+          <w:color w:val="5A5858"/>
+          <w:sz w:val="16"/>
+        </w:rPr>
+        <w:t xml:space="preserve"> </w:t>
       </w:r>
       <w:r>
         <w:rPr>
@@ -2193,31 +2246,22 @@
           <w:sz w:val="20"/>
         </w:rPr>
       </w:pPr>
-      <w:proofErr w:type="spellStart"/>
-      <w:r>
-        <w:rPr>
-          <w:b/>
-          <w:color w:val="4F4F4F"/>
-          <w:sz w:val="20"/>
-        </w:rPr>
-        <w:t>NextEvent</w:t>
-      </w:r>
-      <w:proofErr w:type="spellEnd"/>
-      <w:r>
-        <w:rPr>
-          <w:b/>
-          <w:color w:val="4F4F4F"/>
-          <w:spacing w:val="41"/>
-          <w:sz w:val="20"/>
-        </w:rPr>
-        <w:t xml:space="preserve"> </w:t>
-      </w:r>
-      <w:r>
-        <w:rPr>
-          <w:color w:val="4F4F4F"/>
-          <w:sz w:val="24"/>
-        </w:rPr>
-        <w:t>|</w:t>
+      <w:r>
+        <w:rPr>
+          <w:b/>
+          <w:bCs/>
+          <w:color w:val="4F4F4F"/>
+          <w:sz w:val="20"/>
+          <w:szCs w:val="20"/>
+        </w:rPr>
+        <w:t>Openly</w:t>
+      </w:r>
+      <w:r>
+        <w:rPr>
+          <w:color w:val="4F4F4F"/>
+          <w:sz w:val="24"/>
+        </w:rPr>
+        <w:t xml:space="preserve"> |</w:t>
       </w:r>
       <w:r>
         <w:rPr>
@@ -2232,15 +2276,7 @@
           <w:color w:val="4F4F4F"/>
           <w:sz w:val="20"/>
         </w:rPr>
-        <w:t xml:space="preserve">10/04/2026 - </w:t>
-      </w:r>
-      <w:r>
-        <w:rPr>
-          <w:color w:val="4F4F4F"/>
-          <w:spacing w:val="-2"/>
-          <w:sz w:val="20"/>
-        </w:rPr>
-        <w:t>22/05/2026</w:t>
+        <w:t>Sep 2026 - Current</w:t>
       </w:r>
     </w:p>
     <w:p>
@@ -2249,262 +2285,92 @@
         <w:spacing w:before="122" w:line="271" w:lineRule="auto"/>
         <w:ind w:left="780" w:right="1501"/>
       </w:pPr>
-      <w:proofErr w:type="spellStart"/>
-      <w:r>
-        <w:rPr>
-          <w:color w:val="5A5858"/>
-        </w:rPr>
-        <w:t>NextEvent</w:t>
-      </w:r>
-      <w:proofErr w:type="spellEnd"/>
-      <w:r>
-        <w:rPr>
-          <w:color w:val="5A5858"/>
-        </w:rPr>
-        <w:t xml:space="preserve"> is an</w:t>
-      </w:r>
-      <w:r>
-        <w:rPr>
-          <w:color w:val="5A5858"/>
-          <w:spacing w:val="40"/>
-        </w:rPr>
-        <w:t xml:space="preserve"> </w:t>
-      </w:r>
-      <w:r>
-        <w:rPr>
-          <w:b/>
-          <w:color w:val="5A5858"/>
-        </w:rPr>
-        <w:t>event management platform</w:t>
-      </w:r>
-      <w:r>
-        <w:rPr>
-          <w:b/>
-          <w:color w:val="5A5858"/>
-          <w:spacing w:val="80"/>
-        </w:rPr>
-        <w:t xml:space="preserve"> </w:t>
-      </w:r>
-      <w:r>
-        <w:rPr>
-          <w:color w:val="5A5858"/>
-        </w:rPr>
-        <w:t>that makes it easy to create, discover, and participate in events. Users can add and manage their own events, join public events, and explore upcoming activities based</w:t>
-      </w:r>
-      <w:r>
-        <w:rPr>
-          <w:color w:val="5A5858"/>
-          <w:spacing w:val="-3"/>
-        </w:rPr>
-        <w:t xml:space="preserve"> </w:t>
-      </w:r>
-      <w:r>
-        <w:rPr>
-          <w:color w:val="5A5858"/>
-        </w:rPr>
-        <w:t>on</w:t>
-      </w:r>
-      <w:r>
-        <w:rPr>
-          <w:color w:val="5A5858"/>
-          <w:spacing w:val="-3"/>
-        </w:rPr>
-        <w:t xml:space="preserve"> </w:t>
-      </w:r>
-      <w:r>
-        <w:rPr>
-          <w:color w:val="5A5858"/>
-        </w:rPr>
-        <w:t>their</w:t>
-      </w:r>
-      <w:r>
-        <w:rPr>
-          <w:color w:val="5A5858"/>
-          <w:spacing w:val="-3"/>
-        </w:rPr>
-        <w:t xml:space="preserve"> </w:t>
-      </w:r>
-      <w:r>
-        <w:rPr>
-          <w:color w:val="5A5858"/>
-        </w:rPr>
-        <w:t>interests.</w:t>
-      </w:r>
-      <w:r>
-        <w:rPr>
-          <w:color w:val="5A5858"/>
-          <w:spacing w:val="-3"/>
-        </w:rPr>
-        <w:t xml:space="preserve"> </w:t>
-      </w:r>
-      <w:r>
-        <w:rPr>
-          <w:color w:val="5A5858"/>
-        </w:rPr>
-        <w:t>The</w:t>
-      </w:r>
-      <w:r>
-        <w:rPr>
-          <w:color w:val="5A5858"/>
-          <w:spacing w:val="-3"/>
-        </w:rPr>
-        <w:t xml:space="preserve"> </w:t>
-      </w:r>
-      <w:r>
-        <w:rPr>
-          <w:color w:val="5A5858"/>
-        </w:rPr>
-        <w:t>platform</w:t>
-      </w:r>
-      <w:r>
-        <w:rPr>
-          <w:color w:val="5A5858"/>
-          <w:spacing w:val="-3"/>
-        </w:rPr>
-        <w:t xml:space="preserve"> </w:t>
-      </w:r>
-      <w:r>
-        <w:rPr>
-          <w:color w:val="5A5858"/>
-        </w:rPr>
-        <w:t>also</w:t>
-      </w:r>
-      <w:r>
-        <w:rPr>
-          <w:color w:val="5A5858"/>
-          <w:spacing w:val="-3"/>
-        </w:rPr>
-        <w:t xml:space="preserve"> </w:t>
-      </w:r>
-      <w:r>
-        <w:rPr>
-          <w:color w:val="5A5858"/>
-        </w:rPr>
-        <w:t>features</w:t>
-      </w:r>
-      <w:r>
-        <w:rPr>
-          <w:color w:val="5A5858"/>
-          <w:spacing w:val="-3"/>
-        </w:rPr>
-        <w:t xml:space="preserve"> </w:t>
-      </w:r>
-      <w:r>
-        <w:rPr>
-          <w:color w:val="5A5858"/>
-        </w:rPr>
-        <w:t>an</w:t>
-      </w:r>
-      <w:r>
-        <w:rPr>
-          <w:color w:val="5A5858"/>
-          <w:spacing w:val="-3"/>
-        </w:rPr>
-        <w:t xml:space="preserve"> </w:t>
-      </w:r>
-      <w:r>
-        <w:rPr>
-          <w:color w:val="5A5858"/>
-        </w:rPr>
-        <w:t>interactive</w:t>
-      </w:r>
-      <w:r>
-        <w:rPr>
-          <w:color w:val="5A5858"/>
-          <w:spacing w:val="-3"/>
-        </w:rPr>
-        <w:t xml:space="preserve"> </w:t>
-      </w:r>
-      <w:r>
-        <w:rPr>
-          <w:color w:val="5A5858"/>
-        </w:rPr>
-        <w:t>map,</w:t>
-      </w:r>
-      <w:r>
-        <w:rPr>
-          <w:color w:val="5A5858"/>
-          <w:spacing w:val="-3"/>
-        </w:rPr>
-        <w:t xml:space="preserve"> </w:t>
-      </w:r>
-      <w:r>
-        <w:rPr>
-          <w:color w:val="5A5858"/>
-        </w:rPr>
-        <w:t>allowing</w:t>
-      </w:r>
-      <w:r>
-        <w:rPr>
-          <w:color w:val="5A5858"/>
-          <w:spacing w:val="-3"/>
-        </w:rPr>
-        <w:t xml:space="preserve"> </w:t>
-      </w:r>
-      <w:r>
-        <w:rPr>
-          <w:color w:val="5A5858"/>
-        </w:rPr>
-        <w:t>users</w:t>
-      </w:r>
-      <w:r>
-        <w:rPr>
-          <w:color w:val="5A5858"/>
-          <w:spacing w:val="-3"/>
-        </w:rPr>
-        <w:t xml:space="preserve"> </w:t>
-      </w:r>
-      <w:r>
-        <w:rPr>
-          <w:color w:val="5A5858"/>
-        </w:rPr>
-        <w:t>to</w:t>
-      </w:r>
-      <w:r>
-        <w:rPr>
-          <w:color w:val="5A5858"/>
-          <w:spacing w:val="-3"/>
-        </w:rPr>
-        <w:t xml:space="preserve"> </w:t>
-      </w:r>
-      <w:r>
-        <w:rPr>
-          <w:color w:val="5A5858"/>
-        </w:rPr>
-        <w:t>easily</w:t>
-      </w:r>
-      <w:r>
-        <w:rPr>
-          <w:color w:val="5A5858"/>
-          <w:spacing w:val="-3"/>
-        </w:rPr>
-        <w:t xml:space="preserve"> </w:t>
-      </w:r>
-      <w:r>
-        <w:rPr>
-          <w:color w:val="5A5858"/>
-        </w:rPr>
-        <w:t>view</w:t>
-      </w:r>
-      <w:r>
-        <w:rPr>
-          <w:color w:val="5A5858"/>
-          <w:spacing w:val="-3"/>
-        </w:rPr>
-        <w:t xml:space="preserve"> </w:t>
-      </w:r>
-      <w:r>
-        <w:rPr>
-          <w:color w:val="5A5858"/>
-        </w:rPr>
-        <w:t>event locations and discover events happening nearby.</w:t>
+      <w:r>
+        <w:rPr>
+          <w:b/>
+          <w:bCs/>
+        </w:rPr>
+        <w:t>Openly</w:t>
+      </w:r>
+      <w:r>
+        <w:t xml:space="preserve"> helps young people from Azerbaijan find and apply for opportunities abroad.</w:t>
+      </w:r>
+      <w:r>
+        <w:br/>
+      </w:r>
+      <w:r>
+        <w:t>Programs like Erasmus+, the European Solidarity Corps, and UN Volunteers offer youth exchanges, training, and volunteering — often with travel, accommodation, and food covered. The hard part is finding them in time. Openly brings these opportunities together in one place, reminds you before deadlines close, and tracks what you've saved and applied to.</w:t>
+      </w:r>
+      <w:r>
+        <w:br/>
+      </w:r>
+      <w:r>
+        <w:t xml:space="preserve">For those looking to study abroad, </w:t>
+      </w:r>
+      <w:r>
+        <w:rPr>
+          <w:b/>
+          <w:bCs/>
+        </w:rPr>
+        <w:t>Openly Student</w:t>
+      </w:r>
+      <w:r>
+        <w:t xml:space="preserve"> brings together scholarships, universities, and a step-by-step roadmap. It shows options that match your level and budget, and lets you compare universities side by side.</w:t>
+      </w:r>
+      <w:r>
+        <w:br/>
+      </w:r>
+      <w:r>
+        <w:t xml:space="preserve">An </w:t>
+      </w:r>
+      <w:r>
+        <w:rPr>
+          <w:b/>
+          <w:bCs/>
+        </w:rPr>
+        <w:t>AI assistant</w:t>
+      </w:r>
+      <w:r>
+        <w:t xml:space="preserve"> helps shape your motivation letter, review your CV or essay, and suggest a personalized study-abroad plan.</w:t>
       </w:r>
     </w:p>
     <w:p>
       <w:pPr>
         <w:pStyle w:val="BodyText"/>
-        <w:spacing w:before="110"/>
-      </w:pPr>
+        <w:spacing w:before="122" w:line="271" w:lineRule="auto"/>
+        <w:ind w:left="780" w:right="1501"/>
+      </w:pPr>
+      <w:r>
+        <w:t>Browse for free, no account needed.</w:t>
+      </w:r>
+    </w:p>
+    <w:p>
+      <w:pPr>
+        <w:pStyle w:val="BodyText"/>
+        <w:spacing w:before="122" w:line="271" w:lineRule="auto"/>
+        <w:ind w:left="780" w:right="1501"/>
+      </w:pPr>
+      <w:hyperlink r:id="rId13" w:history="1">
+        <w:proofErr w:type="spellStart"/>
+        <w:r>
+          <w:rPr>
+            <w:rStyle w:val="Hyperlink"/>
+          </w:rPr>
+          <w:t>Github</w:t>
+        </w:r>
+        <w:proofErr w:type="spellEnd"/>
+      </w:hyperlink>
+      <w:r>
+        <w:br/>
+      </w:r>
+      <w:hyperlink r:id="rId14" w:history="1">
+        <w:r>
+          <w:rPr>
+            <w:rStyle w:val="Hyperlink"/>
+          </w:rPr>
+          <w:t>Demo Video</w:t>
+        </w:r>
+      </w:hyperlink>
     </w:p>
     <w:p>
       <w:pPr>
@@ -2516,62 +2382,28 @@
         <w:spacing w:line="271" w:lineRule="auto"/>
         <w:ind w:left="780" w:right="4959"/>
       </w:pPr>
-      <w:hyperlink r:id="rId13">
-        <w:r>
-          <w:rPr>
-            <w:color w:val="004493"/>
-            <w:spacing w:val="-2"/>
-            <w:u w:val="single" w:color="004493"/>
-          </w:rPr>
-          <w:t>https://youtube.com/shorts/oycqlxHBlPs?si=qHyzYehpeUQso5p</w:t>
-        </w:r>
-      </w:hyperlink>
-      <w:r>
-        <w:rPr>
-          <w:color w:val="004493"/>
-          <w:spacing w:val="-2"/>
-          <w:u w:val="single" w:color="004493"/>
-        </w:rPr>
-        <w:t>e</w:t>
-      </w:r>
-      <w:r>
-        <w:rPr>
-          <w:color w:val="004493"/>
-          <w:u w:val="single" w:color="004493"/>
-        </w:rPr>
-        <w:tab/>
-      </w:r>
-      <w:r>
-        <w:rPr>
-          <w:color w:val="004493"/>
-        </w:rPr>
-        <w:t xml:space="preserve"> </w:t>
-      </w:r>
-      <w:hyperlink r:id="rId14">
-        <w:r>
-          <w:rPr>
-            <w:color w:val="004493"/>
-            <w:spacing w:val="-2"/>
-            <w:u w:val="single" w:color="004493"/>
-          </w:rPr>
-          <w:t>https://github.com/1brah1m0f/eventHu</w:t>
-        </w:r>
-      </w:hyperlink>
-      <w:r>
-        <w:rPr>
-          <w:color w:val="004493"/>
-          <w:spacing w:val="-2"/>
-          <w:u w:val="single" w:color="004493"/>
-        </w:rPr>
-        <w:t>b</w:t>
-      </w:r>
-      <w:r>
-        <w:rPr>
-          <w:color w:val="004493"/>
-          <w:u w:val="single" w:color="004493"/>
-        </w:rPr>
-        <w:tab/>
-      </w:r>
+    </w:p>
+    <w:p>
+      <w:pPr>
+        <w:pStyle w:val="BodyText"/>
+        <w:tabs>
+          <w:tab w:val="left" w:pos="4673"/>
+          <w:tab w:val="left" w:pos="6938"/>
+        </w:tabs>
+        <w:spacing w:line="271" w:lineRule="auto"/>
+        <w:ind w:left="780" w:right="4959"/>
+      </w:pPr>
+    </w:p>
+    <w:p>
+      <w:pPr>
+        <w:pStyle w:val="BodyText"/>
+        <w:tabs>
+          <w:tab w:val="left" w:pos="4673"/>
+          <w:tab w:val="left" w:pos="6938"/>
+        </w:tabs>
+        <w:spacing w:line="271" w:lineRule="auto"/>
+        <w:ind w:left="780" w:right="4959"/>
+      </w:pPr>
     </w:p>
     <w:p>
       <w:pPr>
@@ -2589,6 +2421,7 @@
           <w:color w:val="4F4F4F"/>
           <w:sz w:val="20"/>
         </w:rPr>
+        <w:lastRenderedPageBreak/>
         <w:t>KiberEduAz</w:t>
       </w:r>
       <w:proofErr w:type="spellEnd"/>
@@ -2621,15 +2454,35 @@
           <w:color w:val="4F4F4F"/>
           <w:sz w:val="20"/>
         </w:rPr>
-        <w:t xml:space="preserve">31/07/2026 - </w:t>
-      </w:r>
-      <w:r>
-        <w:rPr>
-          <w:color w:val="4F4F4F"/>
-          <w:spacing w:val="-2"/>
-          <w:sz w:val="20"/>
-        </w:rPr>
-        <w:t>Current</w:t>
+        <w:t xml:space="preserve">Aug </w:t>
+      </w:r>
+      <w:r>
+        <w:rPr>
+          <w:color w:val="4F4F4F"/>
+          <w:sz w:val="20"/>
+        </w:rPr>
+        <w:t xml:space="preserve">2026 </w:t>
+      </w:r>
+      <w:r>
+        <w:rPr>
+          <w:color w:val="4F4F4F"/>
+          <w:sz w:val="20"/>
+        </w:rPr>
+        <w:t>–</w:t>
+      </w:r>
+      <w:r>
+        <w:rPr>
+          <w:color w:val="4F4F4F"/>
+          <w:sz w:val="20"/>
+        </w:rPr>
+        <w:t xml:space="preserve"> </w:t>
+      </w:r>
+      <w:r>
+        <w:rPr>
+          <w:color w:val="4F4F4F"/>
+          <w:sz w:val="20"/>
+        </w:rPr>
+        <w:t>Oct 2026</w:t>
       </w:r>
     </w:p>
     <w:p>
@@ -3398,7 +3251,14 @@
           <w:color w:val="4F4F4F"/>
           <w:sz w:val="20"/>
         </w:rPr>
-        <w:t xml:space="preserve">15/09/2025 - </w:t>
+        <w:t>Sep 2</w:t>
+      </w:r>
+      <w:r>
+        <w:rPr>
+          <w:color w:val="4F4F4F"/>
+          <w:sz w:val="20"/>
+        </w:rPr>
+        <w:t xml:space="preserve">025 - </w:t>
       </w:r>
       <w:r>
         <w:rPr>
@@ -3740,21 +3600,12 @@
         </w:rPr>
         <w:t xml:space="preserve"> </w:t>
       </w:r>
-      <w:proofErr w:type="spellStart"/>
-      <w:r>
-        <w:rPr>
-          <w:color w:val="4F4F4F"/>
-          <w:sz w:val="20"/>
-        </w:rPr>
-        <w:t>Holberton</w:t>
-      </w:r>
-      <w:proofErr w:type="spellEnd"/>
-      <w:r>
-        <w:rPr>
-          <w:color w:val="4F4F4F"/>
-          <w:sz w:val="20"/>
-        </w:rPr>
-        <w:t xml:space="preserve"> </w:t>
+      <w:r>
+        <w:rPr>
+          <w:color w:val="4F4F4F"/>
+          <w:sz w:val="20"/>
+        </w:rPr>
+        <w:t xml:space="preserve">Holberton </w:t>
       </w:r>
       <w:r>
         <w:rPr>
@@ -3791,7 +3642,14 @@
           <w:color w:val="4F4F4F"/>
           <w:sz w:val="20"/>
         </w:rPr>
-        <w:t xml:space="preserve">26/10/2025 - </w:t>
+        <w:t>Nov 2025</w:t>
+      </w:r>
+      <w:r>
+        <w:rPr>
+          <w:color w:val="4F4F4F"/>
+          <w:sz w:val="20"/>
+        </w:rPr>
+        <w:t xml:space="preserve"> - </w:t>
       </w:r>
       <w:r>
         <w:rPr>
@@ -4133,14 +3991,32 @@
         <w:rPr>
           <w:color w:val="4F4F4F"/>
         </w:rPr>
-        <w:t xml:space="preserve">12/07/2026 - </w:t>
+        <w:t xml:space="preserve">Jule </w:t>
+      </w:r>
+      <w:r>
+        <w:rPr>
+          <w:color w:val="4F4F4F"/>
+        </w:rPr>
+        <w:t xml:space="preserve">2026 </w:t>
+      </w:r>
+      <w:r>
+        <w:rPr>
+          <w:color w:val="4F4F4F"/>
+        </w:rPr>
+        <w:t>–</w:t>
+      </w:r>
+      <w:r>
+        <w:rPr>
+          <w:color w:val="4F4F4F"/>
+        </w:rPr>
+        <w:t xml:space="preserve"> </w:t>
       </w:r>
       <w:r>
         <w:rPr>
           <w:color w:val="4F4F4F"/>
           <w:spacing w:val="-2"/>
         </w:rPr>
-        <w:t>Current</w:t>
+        <w:t>Sep 2026</w:t>
       </w:r>
       <w:r>
         <w:rPr>
@@ -4307,8 +4183,8 @@
           </mc:Choice>
           <mc:Fallback>
             <w:pict>
-              <v:group w14:anchorId="27D23075" id="Group 5" o:spid="_x0000_s1026" style="width:59.65pt;height:.5pt;mso-position-horizontal-relative:char;mso-position-vertical-relative:line" coordsize="7575,63" o:gfxdata="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">
-                <v:shape id="Graphic 6" o:spid="_x0000_s1027" style="position:absolute;top:31;width:7575;height:13;visibility:visible;mso-wrap-style:square;v-text-anchor:top" coordsize="757555,1270" o:gfxdata="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" path="m,l757097,e" filled="f" strokecolor="#004493" strokeweight=".5pt">
+              <v:group w14:anchorId="27D23075" id="Group 5" o:spid="_x0000_s1026" style="width:59.65pt;height:.5pt;mso-position-horizontal-relative:char;mso-position-vertical-relative:line" coordsize="7575,63" o:gfxdata="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">
+                <v:shape id="Graphic 6" o:spid="_x0000_s1027" style="position:absolute;top:31;width:7575;height:13;visibility:visible;mso-wrap-style:square;v-text-anchor:top" coordsize="757555,1270" o:gfxdata="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" path="m,l757097,e" filled="f" strokecolor="#004493" strokeweight=".5pt">
                   <v:path arrowok="t"/>
                 </v:shape>
                 <w10:anchorlock/>
@@ -4408,7 +4284,7 @@
           </mc:Choice>
           <mc:Fallback>
             <w:pict>
-              <v:shape w14:anchorId="495CD3D6" id="Graphic 7" o:spid="_x0000_s1026" style="position:absolute;margin-left:136.25pt;margin-top:6.55pt;width:419.8pt;height:.1pt;z-index:15729664;visibility:visible;mso-wrap-style:square;mso-wrap-distance-left:0;mso-wrap-distance-top:0;mso-wrap-distance-right:0;mso-wrap-distance-bottom:0;mso-position-horizontal:absolute;mso-position-horizontal-relative:page;mso-position-vertical:absolute;mso-position-vertical-relative:text;v-text-anchor:top" coordsize="5331460,1270" o:gfxdata="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" path="m,l5331027,e" filled="f" strokeweight=".5pt">
+              <v:shape w14:anchorId="495CD3D6" id="Graphic 7" o:spid="_x0000_s1026" style="position:absolute;margin-left:136.25pt;margin-top:6.55pt;width:419.8pt;height:.1pt;z-index:15729664;visibility:visible;mso-wrap-style:square;mso-wrap-distance-left:0;mso-wrap-distance-top:0;mso-wrap-distance-right:0;mso-wrap-distance-bottom:0;mso-position-horizontal:absolute;mso-position-horizontal-relative:page;mso-position-vertical:absolute;mso-position-vertical-relative:text;v-text-anchor:top" coordsize="5331460,1270" o:gfxdata="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" path="m,l5331027,e" filled="f" strokeweight=".5pt">
                 <v:path arrowok="t"/>
                 <w10:wrap anchorx="page"/>
               </v:shape>
@@ -4478,7 +4354,14 @@
           <w:color w:val="4F4F4F"/>
           <w:sz w:val="20"/>
         </w:rPr>
-        <w:t xml:space="preserve">29/07/2026 </w:t>
+        <w:t xml:space="preserve">Jule </w:t>
+      </w:r>
+      <w:r>
+        <w:rPr>
+          <w:color w:val="4F4F4F"/>
+          <w:sz w:val="20"/>
+        </w:rPr>
+        <w:t xml:space="preserve">/2026 </w:t>
       </w:r>
       <w:r>
         <w:rPr>
@@ -4786,21 +4669,12 @@
           <w:sz w:val="16"/>
         </w:rPr>
       </w:pPr>
-      <w:proofErr w:type="spellStart"/>
-      <w:r>
-        <w:rPr>
-          <w:b/>
-          <w:sz w:val="16"/>
-        </w:rPr>
-        <w:t>Honours</w:t>
-      </w:r>
-      <w:proofErr w:type="spellEnd"/>
-      <w:r>
-        <w:rPr>
-          <w:b/>
-          <w:sz w:val="16"/>
-        </w:rPr>
-        <w:t xml:space="preserve"> and Awards</w:t>
+      <w:r>
+        <w:rPr>
+          <w:b/>
+          <w:sz w:val="16"/>
+        </w:rPr>
+        <w:t>Honours and Awards</w:t>
       </w:r>
       <w:r>
         <w:rPr>
@@ -4860,21 +4734,12 @@
         </w:rPr>
         <w:t xml:space="preserve"> </w:t>
       </w:r>
-      <w:proofErr w:type="spellStart"/>
-      <w:r>
-        <w:rPr>
-          <w:color w:val="4F4F4F"/>
-          <w:sz w:val="20"/>
-        </w:rPr>
-        <w:t>Xsolla</w:t>
-      </w:r>
-      <w:proofErr w:type="spellEnd"/>
-      <w:r>
-        <w:rPr>
-          <w:color w:val="4F4F4F"/>
-          <w:sz w:val="20"/>
-        </w:rPr>
-        <w:t xml:space="preserve"> &amp; </w:t>
+      <w:r>
+        <w:rPr>
+          <w:color w:val="4F4F4F"/>
+          <w:sz w:val="20"/>
+        </w:rPr>
+        <w:t xml:space="preserve">Xsolla &amp; </w:t>
       </w:r>
       <w:proofErr w:type="spellStart"/>
       <w:r>
@@ -5212,21 +5077,12 @@
         </w:rPr>
         <w:t xml:space="preserve"> </w:t>
       </w:r>
-      <w:proofErr w:type="spellStart"/>
-      <w:r>
-        <w:rPr>
-          <w:color w:val="4F4F4F"/>
-          <w:sz w:val="20"/>
-        </w:rPr>
-        <w:t>Holberton</w:t>
-      </w:r>
-      <w:proofErr w:type="spellEnd"/>
-      <w:r>
-        <w:rPr>
-          <w:color w:val="4F4F4F"/>
-          <w:sz w:val="20"/>
-        </w:rPr>
-        <w:t xml:space="preserve"> School &amp; </w:t>
+      <w:r>
+        <w:rPr>
+          <w:color w:val="4F4F4F"/>
+          <w:sz w:val="20"/>
+        </w:rPr>
+        <w:t xml:space="preserve">Holberton School &amp; </w:t>
       </w:r>
       <w:r>
         <w:rPr>
@@ -5299,15 +5155,7 @@
           <w:color w:val="4F4F4F"/>
           <w:sz w:val="20"/>
         </w:rPr>
-        <w:t xml:space="preserve"> 2026</w:t>
-      </w:r>
-      <w:r>
-        <w:rPr>
-          <w:b/>
-          <w:color w:val="4F4F4F"/>
-          <w:sz w:val="20"/>
-        </w:rPr>
-        <w:t xml:space="preserve"> (3rd)</w:t>
+        <w:t xml:space="preserve"> 2026 (3rd)</w:t>
       </w:r>
       <w:r>
         <w:rPr>
@@ -5452,21 +5300,12 @@
         </w:rPr>
         <w:t xml:space="preserve"> </w:t>
       </w:r>
-      <w:proofErr w:type="spellStart"/>
-      <w:r>
-        <w:rPr>
-          <w:color w:val="4F4F4F"/>
-          <w:sz w:val="20"/>
-        </w:rPr>
-        <w:t>Holberton</w:t>
-      </w:r>
-      <w:proofErr w:type="spellEnd"/>
-      <w:r>
-        <w:rPr>
-          <w:color w:val="4F4F4F"/>
-          <w:sz w:val="20"/>
-        </w:rPr>
-        <w:t xml:space="preserve"> </w:t>
+      <w:r>
+        <w:rPr>
+          <w:color w:val="4F4F4F"/>
+          <w:sz w:val="20"/>
+        </w:rPr>
+        <w:t xml:space="preserve">Holberton </w:t>
       </w:r>
       <w:r>
         <w:rPr>
@@ -5786,7 +5625,6 @@
         </w:rPr>
         <w:t xml:space="preserve">vector </w:t>
       </w:r>
-      <w:proofErr w:type="gramStart"/>
       <w:r>
         <w:rPr>
           <w:color w:val="4F4F4F"/>
@@ -5794,7 +5632,6 @@
         </w:rPr>
         <w:t>DB</w:t>
       </w:r>
-      <w:proofErr w:type="gramEnd"/>
     </w:p>
     <w:p>
       <w:pPr>
@@ -5930,14 +5767,7 @@
           <w:color w:val="4F4F4F"/>
           <w:sz w:val="20"/>
         </w:rPr>
-        <w:t>:</w:t>
-      </w:r>
-      <w:r>
-        <w:rPr>
-          <w:color w:val="4F4F4F"/>
-          <w:sz w:val="20"/>
-        </w:rPr>
-        <w:t xml:space="preserve"> B2</w:t>
+        <w:t>: B2</w:t>
       </w:r>
     </w:p>
     <w:p>
@@ -5960,7 +5790,7 @@
 </file>
 
 <file path=word/styles.xml><?xml version="1.0" encoding="utf-8"?>
-<w:styles xmlns:mc="http://schemas.openxmlformats.org/markup-compatibility/2006" xmlns:r="http://schemas.openxmlformats.org/officeDocument/2006/relationships" xmlns:w="http://schemas.openxmlformats.org/wordprocessingml/2006/main" xmlns:w14="http://schemas.microsoft.com/office/word/2010/wordml" xmlns:w15="http://schemas.microsoft.com/office/word/2012/wordml" xmlns:w16cex="http://schemas.microsoft.com/office/word/2018/wordml/cex" xmlns:w16cid="http://schemas.microsoft.com/office/word/2016/wordml/cid" xmlns:w16="http://schemas.microsoft.com/office/word/2018/wordml" xmlns:w16sdtdh="http://schemas.microsoft.com/office/word/2020/wordml/sdtdatahash" xmlns:w16se="http://schemas.microsoft.com/office/word/2015/wordml/symex" mc:Ignorable="w14 w15 w16se w16cid w16 w16cex w16sdtdh">
+<w:styles xmlns:mc="http://schemas.openxmlformats.org/markup-compatibility/2006" xmlns:r="http://schemas.openxmlformats.org/officeDocument/2006/relationships" xmlns:w="http://schemas.openxmlformats.org/wordprocessingml/2006/main" xmlns:w14="http://schemas.microsoft.com/office/word/2010/wordml" xmlns:w15="http://schemas.microsoft.com/office/word/2012/wordml" xmlns:w16cex="http://schemas.microsoft.com/office/word/2018/wordml/cex" xmlns:w16cid="http://schemas.microsoft.com/office/word/2016/wordml/cid" xmlns:w16="http://schemas.microsoft.com/office/word/2018/wordml" xmlns:w16du="http://schemas.microsoft.com/office/word/2023/wordml/word16du" xmlns:w16sdtdh="http://schemas.microsoft.com/office/word/2020/wordml/sdtdatahash" xmlns:w16sdtfl="http://schemas.microsoft.com/office/word/2024/wordml/sdtformatlock" xmlns:w16se="http://schemas.microsoft.com/office/word/2015/wordml/symex" mc:Ignorable="w14 w15 w16se w16cid w16 w16cex w16sdtdh w16sdtfl w16du">
   <w:docDefaults>
     <w:rPrDefault>
       <w:rPr>
@@ -6415,6 +6245,29 @@
       <w:spacing w:before="114"/>
     </w:pPr>
   </w:style>
+  <w:style w:type="character" w:styleId="Hyperlink">
+    <w:name w:val="Hyperlink"/>
+    <w:basedOn w:val="DefaultParagraphFont"/>
+    <w:uiPriority w:val="99"/>
+    <w:unhideWhenUsed/>
+    <w:rsid w:val="006B14D6"/>
+    <w:rPr>
+      <w:color w:val="0000FF" w:themeColor="hyperlink"/>
+      <w:u w:val="single"/>
+    </w:rPr>
+  </w:style>
+  <w:style w:type="character" w:styleId="UnresolvedMention">
+    <w:name w:val="Unresolved Mention"/>
+    <w:basedOn w:val="DefaultParagraphFont"/>
+    <w:uiPriority w:val="99"/>
+    <w:semiHidden/>
+    <w:unhideWhenUsed/>
+    <w:rsid w:val="006B14D6"/>
+    <w:rPr>
+      <w:color w:val="605E5C"/>
+      <w:shd w:val="clear" w:color="auto" w:fill="E1DFDD"/>
+    </w:rPr>
+  </w:style>
 </w:styles>
 </file>
 

</xml_diff>